<commit_message>
docs: update Stage 1 web scraping methodology in docx and pdf with production-verified protocols
</commit_message>
<xml_diff>
--- a/Cambodia_CPI_Project_Progress_Report.docx
+++ b/Cambodia_CPI_Project_Progress_Report.docx
@@ -1264,6 +1264,23 @@
       </w:r>
     </w:p>
     <w:p>
+      <w:pPr>
+        <w:spacing w:after="40"/>
+      </w:pPr>
+      <w:r>
+        <w:rPr>
+          <w:b/>
+        </w:rPr>
+        <w:t xml:space="preserve">Automated Daily Ingestion: </w:t>
+      </w:r>
+      <w:r>
+        <w:t>Every morning at 08:00 AM, Apache Airflow orchestrates daily automated data extraction across 11 key retail and service sectors in Cambodia.</w:t>
+      </w:r>
+    </w:p>
+    <w:p>
+      <w:pPr>
+        <w:spacing w:before="60" w:after="40"/>
+      </w:pPr>
       <w:r>
         <w:rPr>
           <w:b/>
@@ -1280,10 +1297,10 @@
         <w:rPr>
           <w:b/>
         </w:rPr>
-        <w:t xml:space="preserve">REST / GraphQL APIs: </w:t>
+        <w:t xml:space="preserve">Direct Store APIs (REST &amp; GraphQL): </w:t>
       </w:r>
       <w:r>
-        <w:t>Reverse-proxy APIs for supermarkets (AEON, DeliShop) and marketplaces (L192).</w:t>
+        <w:t>Directly targets internal reverse-proxy endpoints (AEON 1, AEON 3, DeliShop Asia, BookMeBus) and GraphQL queries (L192) to download structured JSON product catalogs, bypassing client-side web rendering.</w:t>
       </w:r>
     </w:p>
     <w:p>
@@ -1295,10 +1312,10 @@
         <w:rPr>
           <w:b/>
         </w:rPr>
-        <w:t xml:space="preserve">HTTP Requests with TLS Fingerprinting: </w:t>
+        <w:t xml:space="preserve">TLS Fingerprinting (curl_cffi): </w:t>
       </w:r>
       <w:r>
-        <w:t>curl_cffi using Chrome TLS fingerprint impersonation to bypass anti-bot defenses.</w:t>
+        <w:t>Executes HTTP requests with Chrome TLS/JA3 fingerprint impersonation to bypass Cloudflare anti-bot defenses and Web Application Firewalls (WAF) with polite throttling (0.5s–1.0s delay).</w:t>
       </w:r>
     </w:p>
     <w:p>
@@ -1310,10 +1327,40 @@
         <w:rPr>
           <w:b/>
         </w:rPr>
-        <w:t xml:space="preserve">Headless Playwright: </w:t>
+        <w:t xml:space="preserve">Dynamic Browser Escalation (Headless Playwright): </w:t>
       </w:r>
       <w:r>
-        <w:t>Dynamic browser escalation if Cloudflare or 403 Forbidden is met.</w:t>
+        <w:t>Automatically launches an asynchronous headless Chromium browser context when encountering Cloudflare challenges or HTTP 403 Forbidden barriers (e.g., AEON) to render dynamic JavaScript and extract live prices.</w:t>
+      </w:r>
+    </w:p>
+    <w:p>
+      <w:pPr>
+        <w:pStyle w:val="ListBullet"/>
+        <w:spacing w:before="20" w:after="40"/>
+      </w:pPr>
+      <w:r>
+        <w:rPr>
+          <w:b/>
+        </w:rPr>
+        <w:t xml:space="preserve">Public Web Feeds &amp; HTML Parsing: </w:t>
+      </w:r>
+      <w:r>
+        <w:t>Uses BeautifulSoup to extract housing rentals (Khmer24, Realestate.com.kh), scrapes official fuel price caps via Tela Khmer Telegram web feeds with Khmer numeral translation (០–៩ → 0–9), and fetches daily official MEF USD/KHR exchange rates.</w:t>
+      </w:r>
+    </w:p>
+    <w:p>
+      <w:pPr>
+        <w:pStyle w:val="ListBullet"/>
+        <w:spacing w:before="20" w:after="40"/>
+      </w:pPr>
+      <w:r>
+        <w:rPr>
+          <w:b/>
+        </w:rPr>
+        <w:t xml:space="preserve">Defensive Quality Controls: </w:t>
+      </w:r>
+      <w:r>
+        <w:t>Enforces a zero-record circuit breaker (raises an error on empty scrapes to prevent data wipeout) and maintains a static fallback matrix if third-party websites undergo outages.</w:t>
       </w:r>
     </w:p>
     <w:p>

</xml_diff>

<commit_message>
docs: rephrase Stage 1 scraping and Section 5 dashboards using simple and accessible language
</commit_message>
<xml_diff>
--- a/Cambodia_CPI_Project_Progress_Report.docx
+++ b/Cambodia_CPI_Project_Progress_Report.docx
@@ -1271,10 +1271,10 @@
         <w:rPr>
           <w:b/>
         </w:rPr>
-        <w:t xml:space="preserve">Automated Daily Ingestion: </w:t>
+        <w:t xml:space="preserve">Automated Daily Collection: </w:t>
       </w:r>
       <w:r>
-        <w:t>Every morning at 08:00 AM, Apache Airflow orchestrates daily automated data extraction across 11 key retail and service sectors in Cambodia.</w:t>
+        <w:t>Every morning at 08:00 AM, the system automatically collects prices across 11 key stores and services in Cambodia.</w:t>
       </w:r>
     </w:p>
     <w:p>
@@ -1285,7 +1285,7 @@
         <w:rPr>
           <w:b/>
         </w:rPr>
-        <w:t>Protocols &amp; Methods:</w:t>
+        <w:t>How We Collect Prices:</w:t>
       </w:r>
     </w:p>
     <w:p>
@@ -1297,10 +1297,10 @@
         <w:rPr>
           <w:b/>
         </w:rPr>
-        <w:t xml:space="preserve">Direct Store APIs (REST &amp; GraphQL): </w:t>
+        <w:t xml:space="preserve">Direct Store APIs: </w:t>
       </w:r>
       <w:r>
-        <w:t>Directly targets internal reverse-proxy endpoints (AEON 1, AEON 3, DeliShop Asia, BookMeBus) and GraphQL queries (L192) to download structured JSON product catalogs, bypassing client-side web rendering.</w:t>
+        <w:t>Connects directly to the backend of online supermarkets (AEON, DeliShop) and apps (L192, BookMeBus) to download product lists and prices quickly without loading heavy web pages.</w:t>
       </w:r>
     </w:p>
     <w:p>
@@ -1312,10 +1312,10 @@
         <w:rPr>
           <w:b/>
         </w:rPr>
-        <w:t xml:space="preserve">TLS Fingerprinting (curl_cffi): </w:t>
+        <w:t xml:space="preserve">Browser Disguise (curl_cffi): </w:t>
       </w:r>
       <w:r>
-        <w:t>Executes HTTP requests with Chrome TLS/JA3 fingerprint impersonation to bypass Cloudflare anti-bot defenses and Web Application Firewalls (WAF) with polite throttling (0.5s–1.0s delay).</w:t>
+        <w:t>Sends fast automated requests that look like a real Google Chrome browser so store security systems (like Cloudflare) do not block our computer.</w:t>
       </w:r>
     </w:p>
     <w:p>
@@ -1327,10 +1327,10 @@
         <w:rPr>
           <w:b/>
         </w:rPr>
-        <w:t xml:space="preserve">Dynamic Browser Escalation (Headless Playwright): </w:t>
+        <w:t xml:space="preserve">Invisible Browser (Playwright): </w:t>
       </w:r>
       <w:r>
-        <w:t>Automatically launches an asynchronous headless Chromium browser context when encountering Cloudflare challenges or HTTP 403 Forbidden barriers (e.g., AEON) to render dynamic JavaScript and extract live prices.</w:t>
+        <w:t>If a website blocks direct requests with security checks (like 403 Forbidden), the system automatically opens an invisible browser to load the page and read the prices like a real user.</w:t>
       </w:r>
     </w:p>
     <w:p>
@@ -1342,10 +1342,10 @@
         <w:rPr>
           <w:b/>
         </w:rPr>
-        <w:t xml:space="preserve">Public Web Feeds &amp; HTML Parsing: </w:t>
+        <w:t xml:space="preserve">Public Pages &amp; Feeds: </w:t>
       </w:r>
       <w:r>
-        <w:t>Uses BeautifulSoup to extract housing rentals (Khmer24, Realestate.com.kh), scrapes official fuel price caps via Tela Khmer Telegram web feeds with Khmer numeral translation (០–៩ → 0–9), and fetches daily official MEF USD/KHR exchange rates.</w:t>
+        <w:t>Reads apartment rental listings from Khmer24, fuel prices from the Tela Khmer public channel (translating Khmer numbers 0-9), and official daily exchange rates from the Ministry of Economy and Finance (MEF).</w:t>
       </w:r>
     </w:p>
     <w:p>
@@ -1357,10 +1357,10 @@
         <w:rPr>
           <w:b/>
         </w:rPr>
-        <w:t xml:space="preserve">Defensive Quality Controls: </w:t>
+        <w:t xml:space="preserve">Safety &amp; Backup Rules: </w:t>
       </w:r>
       <w:r>
-        <w:t>Enforces a zero-record circuit breaker (raises an error on empty scrapes to prevent data wipeout) and maintains a static fallback matrix if third-party websites undergo outages.</w:t>
+        <w:t>Pauses 1 second between requests so we do not slow down store websites, and sends an alert if 0 products are found so bad data is never saved.</w:t>
       </w:r>
     </w:p>
     <w:p>
@@ -2162,7 +2162,7 @@
         <w:spacing w:before="20" w:after="80"/>
       </w:pPr>
       <w:r>
-        <w:t>Presents real-time daily Headline CPI and Core CPI (excluding volatile Food &amp; Energy), month-over-month (MoM) and year-over-year (YoY) inflation rates, 12 COICOP division breakdowns, and out-of-sample tracking error against official National Institute of Statistics (NIS) monthly reports.</w:t>
+        <w:t>Shows daily Headline CPI and Core CPI (which removes volatile food and fuel prices), monthly inflation rates, and price changes across all 12 consumption categories compared against official government reports.</w:t>
       </w:r>
     </w:p>
     <w:p>
@@ -2233,7 +2233,7 @@
         <w:spacing w:before="20" w:after="80"/>
       </w:pPr>
       <w:r>
-        <w:t>Monitors daily ingestion health across all 11 retail and service data sources. Displays daily scraped observation counts, scraper execution runtimes, HTTP status codes, browser automation latency, and active catalog availability.</w:t>
+        <w:t>Tracks the daily health of our scrapers across all 11 sources. It shows how many product prices were collected each day, scraping speed, and website connection status.</w:t>
       </w:r>
     </w:p>
     <w:p>
@@ -2304,7 +2304,7 @@
         <w:spacing w:before="20" w:after="80"/>
       </w:pPr>
       <w:r>
-        <w:t>Performs live quality screening across raw-to-silver transformations. Tracks unit normalization rates (conversions to 1kg/1L), dual currency conversion (USD/KHR via daily MEF rates), 5-step entity matching waterfall hit rates (Barcode, SKU, text+size, vector pgvector, fuzzy), and Gemini AI classification guardrails (preventing pet food/cleaning chemical classification errors).</w:t>
+        <w:t>Checks the cleanliness of our data every day. It tracks product size standardization (converting items to 1kg or 1L), USD to Khmer Riel currency conversion, product matching across stores, and AI classification accuracy.</w:t>
       </w:r>
     </w:p>
     <w:p>

</xml_diff>

<commit_message>
docs: update Stage 3 Data Cleaning & Standardization and Product Matching in docx and pdf
</commit_message>
<xml_diff>
--- a/Cambodia_CPI_Project_Progress_Report.docx
+++ b/Cambodia_CPI_Project_Progress_Report.docx
@@ -1459,7 +1459,7 @@
         <w:pStyle w:val="Heading3"/>
       </w:pPr>
       <w:r>
-        <w:t>1. Clean the Data (Standardize)</w:t>
+        <w:t>1. Data Cleaning &amp; Standardization</w:t>
       </w:r>
     </w:p>
     <w:p>
@@ -1471,10 +1471,10 @@
         <w:rPr>
           <w:b/>
         </w:rPr>
-        <w:t xml:space="preserve">Removes noise: </w:t>
+        <w:t xml:space="preserve">Clean product names and text: </w:t>
       </w:r>
       <w:r>
-        <w:t>Deletes marketing words (SALE, HOT DEAL, 50% OFF) and old price tags.</w:t>
+        <w:t>Remove HTML, special characters, promotional words (SALE, HOT DEAL, 50% OFF), unnecessary text, and convert text to lowercase.</w:t>
       </w:r>
     </w:p>
     <w:p>
@@ -1486,10 +1486,10 @@
         <w:rPr>
           <w:b/>
         </w:rPr>
-        <w:t xml:space="preserve">Normalizes units: </w:t>
+        <w:t xml:space="preserve">Convert Khmer numerals → Arabic numerals: </w:t>
       </w:r>
       <w:r>
-        <w:t>Converts volumes and weights into standard sizes (500ml, 1kg) to calculate price per liter/kg.</w:t>
+        <w:t>Convert Khmer digits (e.g., ៥០០ → 500) for consistent processing.</w:t>
       </w:r>
     </w:p>
     <w:p>
@@ -1501,10 +1501,10 @@
         <w:rPr>
           <w:b/>
         </w:rPr>
-        <w:t xml:space="preserve">Handles dual currency: </w:t>
+        <w:t xml:space="preserve">Convert USD → KHR: </w:t>
       </w:r>
       <w:r>
-        <w:t>Converts USD and Khmer Riel using the daily MEF exchange rate.</w:t>
+        <w:t>Convert dual currencies using the official MEF daily exchange rate.</w:t>
       </w:r>
     </w:p>
     <w:p>
@@ -1516,10 +1516,25 @@
         <w:rPr>
           <w:b/>
         </w:rPr>
-        <w:t xml:space="preserve">Fixes Khmer text: </w:t>
+        <w:t xml:space="preserve">Standardize weight, volume, and package units: </w:t>
       </w:r>
       <w:r>
-        <w:t>Segments unspaced Khmer words and translates digits (០-៩ → 0-9).</w:t>
+        <w:t>Convert package sizes into standard metric units (e.g., 500g to 0.5kg, 1500ml to 1.5L).</w:t>
+      </w:r>
+    </w:p>
+    <w:p>
+      <w:pPr>
+        <w:pStyle w:val="ListBullet"/>
+        <w:spacing w:before="20" w:after="40"/>
+      </w:pPr>
+      <w:r>
+        <w:rPr>
+          <w:b/>
+        </w:rPr>
+        <w:t xml:space="preserve">Calculate unit prices (KHR/kg, KHR/L, etc.): </w:t>
+      </w:r>
+      <w:r>
+        <w:t>Compute unit price (P_unit = Price in KHR / Normalized Metric) to fairly compare different product sizes.</w:t>
       </w:r>
     </w:p>
     <w:p>
@@ -1527,7 +1542,7 @@
         <w:pStyle w:val="Heading3"/>
       </w:pPr>
       <w:r>
-        <w:t>2. Match the Product (Find the Same Item)</w:t>
+        <w:t>2. Product Matching (Find the Same Item)</w:t>
       </w:r>
     </w:p>
     <w:p>
@@ -1544,10 +1559,10 @@
         <w:rPr>
           <w:b/>
         </w:rPr>
-        <w:t xml:space="preserve">Barcode (GTIN): </w:t>
+        <w:t xml:space="preserve">Level 1 — Barcode (GTIN/EAN): </w:t>
       </w:r>
       <w:r>
-        <w:t>Exact match.</w:t>
+        <w:t>Exact barcode match.</w:t>
       </w:r>
     </w:p>
     <w:p>
@@ -1559,7 +1574,7 @@
         <w:rPr>
           <w:b/>
         </w:rPr>
-        <w:t xml:space="preserve">Store SKU: </w:t>
+        <w:t xml:space="preserve">Level 2 — Store SKU: </w:t>
       </w:r>
       <w:r>
         <w:t>Match with past days' catalog.</w:t>
@@ -1574,7 +1589,7 @@
         <w:rPr>
           <w:b/>
         </w:rPr>
-        <w:t xml:space="preserve">Clean Name &amp; Size: </w:t>
+        <w:t xml:space="preserve">Level 3 — Clean Name &amp; Size: </w:t>
       </w:r>
       <w:r>
         <w:t>Exact text match with size protection (prevents 330ml matching 1.5L).</w:t>
@@ -1589,7 +1604,7 @@
         <w:rPr>
           <w:b/>
         </w:rPr>
-        <w:t xml:space="preserve">AI Vector (pgvector): </w:t>
+        <w:t xml:space="preserve">Level 4 — AI Vector (pgvector): </w:t>
       </w:r>
       <w:r>
         <w:t>Matches English and Khmer equivalents (≥95% similarity).</w:t>
@@ -1604,7 +1619,7 @@
         <w:rPr>
           <w:b/>
         </w:rPr>
-        <w:t xml:space="preserve">Fuzzy Spelling: </w:t>
+        <w:t xml:space="preserve">Level 5 — Fuzzy Spelling: </w:t>
       </w:r>
       <w:r>
         <w:t>Catches small typos.</w:t>

</xml_diff>

<commit_message>
docs: expand Section 4.3 (4-level product matching & AI COICOP) and Section 4.4 (CPI calculation, chain-linking & imputation)
</commit_message>
<xml_diff>
--- a/Cambodia_CPI_Project_Progress_Report.docx
+++ b/Cambodia_CPI_Project_Progress_Report.docx
@@ -1425,7 +1425,7 @@
         <w:pStyle w:val="Heading2"/>
       </w:pPr>
       <w:r>
-        <w:t>Stage 3: Silver Layer (Standardization, AI Classification &amp; Quality Control)</w:t>
+        <w:t>Stage 3: Silver Layer (Data Preprocessing, Matching &amp; AI Classification)</w:t>
       </w:r>
     </w:p>
     <w:p>
@@ -1459,7 +1459,7 @@
         <w:pStyle w:val="Heading3"/>
       </w:pPr>
       <w:r>
-        <w:t>1. Data Cleaning &amp; Standardization</w:t>
+        <w:t>4.3.1 Data Cleaning &amp; Standardization</w:t>
       </w:r>
     </w:p>
     <w:p>
@@ -1542,87 +1542,263 @@
         <w:pStyle w:val="Heading3"/>
       </w:pPr>
       <w:r>
-        <w:t>2. Product Matching (Find the Same Item)</w:t>
+        <w:t>4.3.2 Product Matching (4-Level Waterfall)</w:t>
       </w:r>
     </w:p>
     <w:p>
       <w:r>
-        <w:t>Connects identical products across different stores (e.g., AEON vs. DeliShop) using a 5-step waterfall:</w:t>
+        <w:t>Connects identical products across different stores and tracks them day-after-day:</w:t>
+      </w:r>
+    </w:p>
+    <w:p>
+      <w:pPr>
+        <w:spacing w:before="40" w:after="20"/>
+      </w:pPr>
+      <w:r>
+        <w:rPr>
+          <w:b/>
+        </w:rPr>
+        <w:t xml:space="preserve">Level 1 — Barcode (GTIN / EAN): </w:t>
+      </w:r>
+      <w:r>
+        <w:t>Matches the exact same item across different stores (e.g., AEON ↔ DeliShop) using global standard barcodes.</w:t>
+      </w:r>
+    </w:p>
+    <w:p>
+      <w:pPr>
+        <w:spacing w:before="40" w:after="20"/>
+      </w:pPr>
+      <w:r>
+        <w:rPr>
+          <w:b/>
+        </w:rPr>
+        <w:t xml:space="preserve">Level 2 — Store ID + SKU (Composite Key): </w:t>
+      </w:r>
+      <w:r>
+        <w:t>Remembers the item day-after-day within the same store (AEON yesterday ↔ AEON today).</w:t>
       </w:r>
     </w:p>
     <w:p>
       <w:pPr>
         <w:pStyle w:val="ListBullet"/>
-        <w:spacing w:before="20" w:after="40"/>
+        <w:spacing w:before="20" w:after="20"/>
       </w:pPr>
       <w:r>
         <w:rPr>
           <w:b/>
         </w:rPr>
-        <w:t xml:space="preserve">Level 1 — Barcode (GTIN/EAN): </w:t>
+        <w:t xml:space="preserve">What is SKU? </w:t>
       </w:r>
       <w:r>
-        <w:t>Exact barcode match.</w:t>
+        <w:t>A unique Stock Keeping Unit code assigned by a store, extracted directly from product URLs or store APIs.</w:t>
       </w:r>
     </w:p>
     <w:p>
       <w:pPr>
         <w:pStyle w:val="ListBullet"/>
-        <w:spacing w:before="20" w:after="40"/>
+        <w:spacing w:before="20" w:after="20"/>
       </w:pPr>
       <w:r>
         <w:rPr>
           <w:b/>
         </w:rPr>
-        <w:t xml:space="preserve">Level 2 — Store SKU: </w:t>
+        <w:t xml:space="preserve">The Problem: </w:t>
       </w:r>
       <w:r>
-        <w:t>Match with past days' catalog.</w:t>
+        <w:t>Different stores reuse the same SKU number (e.g., SKU 100 at AEON is Beef Curry, but at DeliShop is Fruit Syrup).</w:t>
       </w:r>
     </w:p>
     <w:p>
       <w:pPr>
         <w:pStyle w:val="ListBullet"/>
-        <w:spacing w:before="20" w:after="40"/>
+        <w:spacing w:before="20" w:after="20"/>
       </w:pPr>
       <w:r>
         <w:rPr>
           <w:b/>
         </w:rPr>
-        <w:t xml:space="preserve">Level 3 — Clean Name &amp; Size: </w:t>
+        <w:t xml:space="preserve">The Solution (Composite Key): </w:t>
       </w:r>
       <w:r>
-        <w:t>Exact text match with size protection (prevents 330ml matching 1.5L).</w:t>
+        <w:t>Combines (store_id, sku) so each store catalog remains strictly isolated.</w:t>
       </w:r>
     </w:p>
     <w:p>
       <w:pPr>
         <w:pStyle w:val="ListBullet"/>
-        <w:spacing w:before="20" w:after="40"/>
+        <w:spacing w:before="20" w:after="20"/>
       </w:pPr>
       <w:r>
         <w:rPr>
           <w:b/>
         </w:rPr>
-        <w:t xml:space="preserve">Level 4 — AI Vector (pgvector): </w:t>
+        <w:t xml:space="preserve">Learn Once, Cache Forever: </w:t>
       </w:r>
       <w:r>
-        <w:t>Matches English and Khmer equivalents (≥95% similarity).</w:t>
+        <w:t>The first time an item is scraped, it is saved into canonical tables. On daily scrapes, the system instantly recognizes it without re-matching.</w:t>
+      </w:r>
+    </w:p>
+    <w:p>
+      <w:pPr>
+        <w:spacing w:before="40" w:after="20"/>
+      </w:pPr>
+      <w:r>
+        <w:rPr>
+          <w:b/>
+        </w:rPr>
+        <w:t xml:space="preserve">Level 3 — Exact Text Matching: </w:t>
+      </w:r>
+      <w:r>
+        <w:t>Links different stores selling the exact same product when no barcode is available.</w:t>
       </w:r>
     </w:p>
     <w:p>
       <w:pPr>
         <w:pStyle w:val="ListBullet"/>
-        <w:spacing w:before="20" w:after="40"/>
+        <w:spacing w:before="20" w:after="20"/>
       </w:pPr>
       <w:r>
         <w:rPr>
           <w:b/>
         </w:rPr>
-        <w:t xml:space="preserve">Level 5 — Fuzzy Spelling: </w:t>
+        <w:t xml:space="preserve">When Triggered? </w:t>
       </w:r>
       <w:r>
-        <w:t>Catches small typos.</w:t>
+        <w:t>When no universal barcode is provided and the store SKU is unseen.</w:t>
+      </w:r>
+    </w:p>
+    <w:p>
+      <w:pPr>
+        <w:pStyle w:val="ListBullet"/>
+        <w:spacing w:before="20" w:after="20"/>
+      </w:pPr>
+      <w:r>
+        <w:rPr>
+          <w:b/>
+        </w:rPr>
+        <w:t xml:space="preserve">Why Needed? </w:t>
+      </w:r>
+      <w:r>
+        <w:t>Different stores assign different SKUs to the exact same item (e.g., AEON SKU 123 vs. AryStore SKU 999 for 'Samsung Galaxy A27 128GB' at $250 vs $240). Without text matching, the system would mistakenly treat them as two different items.</w:t>
+      </w:r>
+    </w:p>
+    <w:p>
+      <w:pPr>
+        <w:pStyle w:val="ListBullet"/>
+        <w:spacing w:before="20" w:after="20"/>
+      </w:pPr>
+      <w:r>
+        <w:rPr>
+          <w:b/>
+        </w:rPr>
+        <w:t xml:space="preserve">How We Connect Them: </w:t>
+      </w:r>
+      <w:r>
+        <w:t>Ignores store SKUs and matches on the cleaned product title and package size to link both stores to the exact same item.</w:t>
+      </w:r>
+    </w:p>
+    <w:p>
+      <w:pPr>
+        <w:spacing w:before="40" w:after="20"/>
+      </w:pPr>
+      <w:r>
+        <w:rPr>
+          <w:b/>
+        </w:rPr>
+        <w:t xml:space="preserve">Level 4 — Vector Embedding + Deterministic Spec Guard: </w:t>
+      </w:r>
+      <w:r>
+        <w:t>Matches English and Khmer equivalents and catches minor product title variations using machine learning.</w:t>
+      </w:r>
+    </w:p>
+    <w:p>
+      <w:pPr>
+        <w:pStyle w:val="ListBullet"/>
+        <w:spacing w:before="20" w:after="20"/>
+      </w:pPr>
+      <w:r>
+        <w:rPr>
+          <w:b/>
+        </w:rPr>
+        <w:t xml:space="preserve">What is Vector Embedding? </w:t>
+      </w:r>
+      <w:r>
+        <w:t>A technique that converts words and sentences into a 768-dimensional sequence of numbers (vector) in high-dimensional semantic space.</w:t>
+      </w:r>
+    </w:p>
+    <w:p>
+      <w:pPr>
+        <w:pStyle w:val="ListBullet"/>
+        <w:spacing w:before="20" w:after="20"/>
+      </w:pPr>
+      <w:r>
+        <w:rPr>
+          <w:b/>
+        </w:rPr>
+        <w:t xml:space="preserve">Stage 1 (Fast Vector Search): </w:t>
+      </w:r>
+      <w:r>
+        <w:t>Converts cleaned title into a 768-dim embedding (gemini-embedding-2) and searches silver.canonical_items using PostgreSQL pgvector HNSW Cosine Index to return the Top 30 candidate matches.</w:t>
+      </w:r>
+    </w:p>
+    <w:p>
+      <w:pPr>
+        <w:pStyle w:val="ListBullet"/>
+        <w:spacing w:before="20" w:after="20"/>
+      </w:pPr>
+      <w:r>
+        <w:rPr>
+          <w:b/>
+        </w:rPr>
+        <w:t xml:space="preserve">Stage 2 (Deterministic Spec Guard): </w:t>
+      </w:r>
+      <w:r>
+        <w:t>Inspects physical specs of Top 30 candidates to automatically REJECT false merges:</w:t>
+      </w:r>
+    </w:p>
+    <w:p>
+      <w:pPr>
+        <w:pStyle w:val="ListBullet"/>
+        <w:spacing w:before="20" w:after="20"/>
+      </w:pPr>
+      <w:r>
+        <w:rPr>
+          <w:b/>
+        </w:rPr>
+        <w:t xml:space="preserve">  • Pack Count Rejection: </w:t>
+      </w:r>
+      <w:r>
+        <w:t>'1 can' != '24-pack carton' ──► REJECTED</w:t>
+      </w:r>
+    </w:p>
+    <w:p>
+      <w:pPr>
+        <w:pStyle w:val="ListBullet"/>
+        <w:spacing w:before="20" w:after="20"/>
+      </w:pPr>
+      <w:r>
+        <w:rPr>
+          <w:b/>
+        </w:rPr>
+        <w:t xml:space="preserve">  • Storage Rejection: </w:t>
+      </w:r>
+      <w:r>
+        <w:t>'128GB' != '256GB' ──► REJECTED</w:t>
+      </w:r>
+    </w:p>
+    <w:p>
+      <w:pPr>
+        <w:pStyle w:val="ListBullet"/>
+        <w:spacing w:before="20" w:after="20"/>
+      </w:pPr>
+      <w:r>
+        <w:rPr>
+          <w:b/>
+        </w:rPr>
+        <w:t xml:space="preserve">Decision Rule: </w:t>
+      </w:r>
+      <w:r>
+        <w:t>Match approved if Cosine Similarity ≥ 0.80 and passes Spec Guard ──► Merged into True Canonical Item. Otherwise, split as a new item.</w:t>
       </w:r>
     </w:p>
     <w:p>
@@ -1630,16 +1806,74 @@
         <w:pStyle w:val="Heading3"/>
       </w:pPr>
       <w:r>
-        <w:t>3. Classify into Official Baskets (UN COICOP)</w:t>
+        <w:t>4.3.3 AI Classification into Official COICOP Baskets</w:t>
+      </w:r>
+    </w:p>
+    <w:p>
+      <w:pPr>
+        <w:spacing w:before="20" w:after="40"/>
+      </w:pPr>
+      <w:r>
+        <w:rPr>
+          <w:b/>
+        </w:rPr>
+        <w:t xml:space="preserve">What is COICOP? </w:t>
+      </w:r>
+      <w:r>
+        <w:t>Classification of Individual Consumption According to Purpose. It is the official standard used by the United Nations and Cambodia's National Institute of Statistics (NIS) to group products to calculate CPI.</w:t>
+      </w:r>
+    </w:p>
+    <w:p>
+      <w:r>
+        <w:rPr>
+          <w:b/>
+        </w:rPr>
+        <w:t>Two-Tier Classification Process:</w:t>
       </w:r>
     </w:p>
     <w:p>
       <w:pPr>
         <w:pStyle w:val="ListBullet"/>
-        <w:spacing w:before="20" w:after="40"/>
+        <w:spacing w:before="20" w:after="20"/>
       </w:pPr>
       <w:r>
-        <w:t>Uses Google Gemini AI in batches to assign the official 4-digit government code (e.g., 01.1.1 for Rice/Bread).</w:t>
+        <w:rPr>
+          <w:b/>
+        </w:rPr>
+        <w:t xml:space="preserve">Tier 1 — Store-Specific Matching: </w:t>
+      </w:r>
+      <w:r>
+        <w:t>For single-category stores, the database automatically assigns both the 2-digit division and exact 5-digit subclass without calling AI. Examples: Telecom (Smart, Cellcard) ──► 08 | 08.3.0 (Telephone &amp; Internet Services); Transport (BookMeBus) ──► 07 | 07.3.2 (Passenger Road Transport).</w:t>
+      </w:r>
+    </w:p>
+    <w:p>
+      <w:pPr>
+        <w:pStyle w:val="ListBullet"/>
+        <w:spacing w:before="20" w:after="20"/>
+      </w:pPr>
+      <w:r>
+        <w:rPr>
+          <w:b/>
+        </w:rPr>
+        <w:t xml:space="preserve">Tier 2 — Gemini AI (Supermarkets &amp; Multi-Category): </w:t>
+      </w:r>
+      <w:r>
+        <w:t>For broad stores (AEON, DeliShop, Lucky), products are sent in batches of 40 to Gemini AI to assign the official NIS 5-digit code. Rotates across 4 API keys with 30s cooldown, returning structured JSON directly into PostgreSQL.</w:t>
+      </w:r>
+    </w:p>
+    <w:p>
+      <w:pPr>
+        <w:pStyle w:val="ListBullet"/>
+        <w:spacing w:before="20" w:after="20"/>
+      </w:pPr>
+      <w:r>
+        <w:rPr>
+          <w:b/>
+        </w:rPr>
+        <w:t xml:space="preserve">The 'Learn Once, Cache Forever' Strategy: </w:t>
+      </w:r>
+      <w:r>
+        <w:t>Products are classified on their first scrape and stored permanently in the database. Daily runs match existing items and skip AI classification entirely, only sending truly new products.</w:t>
       </w:r>
     </w:p>
     <w:p>
@@ -1656,7 +1890,7 @@
     <w:p>
       <w:pPr>
         <w:pStyle w:val="ListBullet"/>
-        <w:spacing w:before="20" w:after="40"/>
+        <w:spacing w:before="20" w:after="20"/>
       </w:pPr>
       <w:r>
         <w:rPr>
@@ -1671,7 +1905,7 @@
     <w:p>
       <w:pPr>
         <w:pStyle w:val="ListBullet"/>
-        <w:spacing w:before="20" w:after="40"/>
+        <w:spacing w:before="20" w:after="20"/>
       </w:pPr>
       <w:r>
         <w:rPr>
@@ -1686,7 +1920,7 @@
     <w:p>
       <w:pPr>
         <w:pStyle w:val="ListBullet"/>
-        <w:spacing w:before="20" w:after="40"/>
+        <w:spacing w:before="20" w:after="20"/>
       </w:pPr>
       <w:r>
         <w:rPr>
@@ -1708,7 +1942,7 @@
         <w:pStyle w:val="Heading2"/>
       </w:pPr>
       <w:r>
-        <w:t>The Gold Layer in Brief: From Clean Products to Official CPI</w:t>
+        <w:t>4.4 CPI Calculation (From Thousands of Scraped Prices to One CPI Number)</w:t>
       </w:r>
     </w:p>
     <w:p>
@@ -1716,11 +1950,10 @@
         <w:spacing w:after="60"/>
       </w:pPr>
       <w:r>
-        <w:t>The Gold Layer applies official international standards (ILO / UN guidelines) to turn thousands of clean daily prices into national economic indicators.</w:t>
-        <w:br/>
-      </w:r>
-      <w:r>
-        <w:t>It does this in 3 main steps:</w:t>
+        <w:rPr>
+          <w:b/>
+        </w:rPr>
+        <w:t>Calculation Aggregation Pipeline:</w:t>
         <w:br/>
       </w:r>
       <w:r>
@@ -1728,7 +1961,7 @@
           <w:b/>
           <w:color w:val="0C2C62"/>
         </w:rPr>
-        <w:t>[Clean Silver Items] ──► 1. Jevons Index ──► 2. Laspeyres Aggregation ──► 3. Core CPI &amp; Marts</w:t>
+        <w:t>Product Quote ──► Relative Price ──► Store-Level Jevons ──► Elementary Aggregation ──► Class Weight ──► Group Weight ──► Division Weight ──► National CPI</w:t>
       </w:r>
     </w:p>
     <w:p>
@@ -1736,58 +1969,12 @@
         <w:pStyle w:val="Heading3"/>
       </w:pPr>
       <w:r>
-        <w:t>1. Elementary Index Calculation (Jevons Formula)</w:t>
-      </w:r>
-    </w:p>
-    <w:p>
-      <w:pPr>
-        <w:pStyle w:val="ListBullet"/>
-        <w:spacing w:before="20" w:after="40"/>
-      </w:pPr>
-      <w:r>
-        <w:rPr>
-          <w:b/>
-        </w:rPr>
-        <w:t xml:space="preserve">(Jevons Geometric Mean): </w:t>
-      </w:r>
-      <w:r>
-        <w:t>Instead of a simple average (which gets distorted by expensive luxury items), the system uses the geometric mean:</w:t>
-        <w:br/>
-      </w:r>
-      <w:r>
-        <w:rPr>
-          <w:b/>
-          <w:color w:val="146E78"/>
-        </w:rPr>
-        <w:t>I_rice,t = ( (P_1,t / P_1,0) × (P_2,t / P_2,0) × ... × (P_n,t / P_n,0) )^(1/n)</w:t>
-      </w:r>
-    </w:p>
-    <w:p>
-      <w:pPr>
-        <w:pStyle w:val="ListBullet"/>
-        <w:spacing w:before="20" w:after="40"/>
-      </w:pPr>
-      <w:r>
-        <w:rPr>
-          <w:b/>
-        </w:rPr>
-        <w:t xml:space="preserve">Missing Price Imputation: </w:t>
-      </w:r>
-      <w:r>
-        <w:t>If an item is temporarily out-of-stock, a 7-day carry-forward rule fills in the price so the index doesn't jump wildly.</w:t>
-      </w:r>
-    </w:p>
-    <w:p>
-      <w:pPr>
-        <w:pStyle w:val="Heading3"/>
-      </w:pPr>
-      <w:r>
-        <w:t>2. Official National Aggregation (Laspeyres Formula)</w:t>
+        <w:t>4.4.1 Relative Price</w:t>
       </w:r>
     </w:p>
     <w:p>
       <w:r>
-        <w:t>Cambodians spend more money on food than on furniture. To reflect real life, the 12 COICOP divisions are combined using official government survey expenditure weights (CSES 2020):</w:t>
+        <w:t>How do we track a product's price change relative to the baseline?</w:t>
       </w:r>
     </w:p>
     <w:p>
@@ -1799,13 +1986,79 @@
           <w:b/>
           <w:color w:val="146E78"/>
         </w:rPr>
-        <w:t>Headline CPI = ∑ ( Weight × Division Index )</w:t>
+        <w:t>r_{i, s, t} = P_{i, s, t} / P_{i, s, 0}</w:t>
+        <w:br/>
+      </w:r>
+      <w:r>
+        <w:t>Where:</w:t>
+        <w:br/>
+        <w:t>• i: specific item | s: specific store | t: current date | e: elementary aggregate (subclass/class)</w:t>
+        <w:br/>
+        <w:t>• P_{i, s, t}: price of item i at store s on day t</w:t>
+        <w:br/>
+        <w:t>• P_{i, s, 0}: reference base price of item i at store s</w:t>
+        <w:br/>
+        <w:t>• r &gt; 1: price increase | r &lt; 1: price decrease</w:t>
+      </w:r>
+    </w:p>
+    <w:p>
+      <w:pPr>
+        <w:pStyle w:val="Heading3"/>
+      </w:pPr>
+      <w:r>
+        <w:t>4.4.2 Store-Level Jevons &amp; Elementary Aggregation</w:t>
+      </w:r>
+    </w:p>
+    <w:p>
+      <w:r>
+        <w:t>Within each store and product category, the pipeline calculates the unweighted geometric mean (Jevons formula) using numerical log-prices to prevent arithmetic distortion and floating-point errors:</w:t>
+      </w:r>
+    </w:p>
+    <w:p>
+      <w:pPr>
+        <w:spacing w:before="20" w:after="40"/>
+      </w:pPr>
+      <w:r>
+        <w:rPr>
+          <w:b/>
+          <w:color w:val="146E78"/>
+        </w:rPr>
+        <w:t>ln I_{s, t}^{Jevons} = (1 / n) ∑ (ln P_{i, s, t} - ln P_{i, s, 0})</w:t>
+        <w:br/>
+      </w:r>
+      <w:r>
+        <w:t>Store-level indices are then aggregated across all eligible stores to compute the Elementary Aggregate index for category e at day t.</w:t>
+      </w:r>
+    </w:p>
+    <w:p>
+      <w:pPr>
+        <w:pStyle w:val="Heading3"/>
+      </w:pPr>
+      <w:r>
+        <w:t>4.4.4 Higher-Level Aggregation (Laspeyres CSES 2020 Weights)</w:t>
+      </w:r>
+    </w:p>
+    <w:p>
+      <w:r>
+        <w:t>To reflect Cambodian household spending, the 12 COICOP divisions are synthesized using official CSES 2020 survey weights:</w:t>
+      </w:r>
+    </w:p>
+    <w:p>
+      <w:pPr>
+        <w:spacing w:before="20" w:after="40"/>
+      </w:pPr>
+      <w:r>
+        <w:rPr>
+          <w:b/>
+          <w:color w:val="146E78"/>
+        </w:rPr>
+        <w:t>Headline CPI = ∑ ( Weight_j × Division_Index_j )</w:t>
       </w:r>
     </w:p>
     <w:p>
       <w:pPr>
         <w:pStyle w:val="ListBullet"/>
-        <w:spacing w:before="20" w:after="40"/>
+        <w:spacing w:before="20" w:after="20"/>
       </w:pPr>
       <w:r>
         <w:rPr>
@@ -1820,7 +2073,7 @@
     <w:p>
       <w:pPr>
         <w:pStyle w:val="ListBullet"/>
-        <w:spacing w:before="20" w:after="40"/>
+        <w:spacing w:before="20" w:after="20"/>
       </w:pPr>
       <w:r>
         <w:rPr>
@@ -1835,7 +2088,7 @@
     <w:p>
       <w:pPr>
         <w:pStyle w:val="ListBullet"/>
-        <w:spacing w:before="20" w:after="40"/>
+        <w:spacing w:before="20" w:after="20"/>
       </w:pPr>
       <w:r>
         <w:rPr>
@@ -1850,7 +2103,7 @@
     <w:p>
       <w:pPr>
         <w:pStyle w:val="ListBullet"/>
-        <w:spacing w:before="20" w:after="40"/>
+        <w:spacing w:before="20" w:after="20"/>
       </w:pPr>
       <w:r>
         <w:rPr>
@@ -1864,15 +2117,80 @@
     </w:p>
     <w:p>
       <w:pPr>
+        <w:pStyle w:val="ListBullet"/>
+        <w:spacing w:before="20" w:after="20"/>
+      </w:pPr>
+      <w:r>
+        <w:rPr>
+          <w:b/>
+        </w:rPr>
+        <w:t xml:space="preserve">Refined Core CPI: </w:t>
+      </w:r>
+      <w:r>
+        <w:t>Excludes volatile Food (01) and Energy (04) to measure underlying long-term price stability.</w:t>
+      </w:r>
+    </w:p>
+    <w:p>
+      <w:pPr>
         <w:pStyle w:val="Heading3"/>
       </w:pPr>
       <w:r>
-        <w:t>3. Central Bank Metric: Core CPI</w:t>
+        <w:t>4.4.5 Chain-Linking (Connecting to Official NIS &amp; Rolling into Next Year)</w:t>
+      </w:r>
+    </w:p>
+    <w:p>
+      <w:pPr>
+        <w:spacing w:after="40"/>
+      </w:pPr>
+      <w:r>
+        <w:rPr>
+          <w:b/>
+        </w:rPr>
+        <w:t>1. Connecting to Official NIS Benchmark (Base Converter):</w:t>
+        <w:br/>
+      </w:r>
+      <w:r>
+        <w:t>• What is the problem? NIS started measuring in 2006 at 100. Over 20 years, prices doubled and their August CPI reached 219.007. Our web scraper started August 18, 2026 at 100. How can we compare NIS 219 vs. Our 99.76%?</w:t>
+        <w:br/>
+      </w:r>
+      <w:r>
+        <w:t>• The Solution (Converter / Splicing): We multiply our monthly index by the official base factor (219.007 / 100 = 2.19007). If our calculated August index is 99.76%, then: 99.76 × 2.19007 = 218.47. Now our daily results are directly comparable to official NIS releases.</w:t>
+      </w:r>
+    </w:p>
+    <w:p>
+      <w:pPr>
+        <w:spacing w:before="60" w:after="40"/>
+      </w:pPr>
+      <w:r>
+        <w:rPr>
+          <w:b/>
+        </w:rPr>
+        <w:t>2. Annual Chain-Linking (December Overlap — Rolling into Next Year):</w:t>
+        <w:br/>
+      </w:r>
+      <w:r>
+        <w:t>• The Problem: What happens when December ends and the basket resets? If January resets back to 100.0, the graph shows a fake collapse.</w:t>
+        <w:br/>
+      </w:r>
+      <w:r>
+        <w:t>• The Solution: We calculate the December monthly average (e.g., 105.0). The new series starts fresh at 100.0, but is multiplied by 1.05.</w:t>
+        <w:br/>
+      </w:r>
+      <w:r>
+        <w:t>• Result: Discontinued items cleanly exit; new products become official base; and the multi-year index climbs continuously with zero New Year cliffs.</w:t>
+      </w:r>
+    </w:p>
+    <w:p>
+      <w:pPr>
+        <w:pStyle w:val="Heading3"/>
+      </w:pPr>
+      <w:r>
+        <w:t>4.4.7 Missing Price &amp; Out-of-Stock Handling</w:t>
       </w:r>
     </w:p>
     <w:p>
       <w:r>
-        <w:t>For central bankers at the National Bank of Cambodia (NBC), temporary global oil spikes or seasonal vegetable floods distort the real picture:</w:t>
+        <w:t>When an item is missing from today's scrape, how do we handle it?</w:t>
       </w:r>
     </w:p>
     <w:p>
@@ -1884,22 +2202,55 @@
         <w:rPr>
           <w:b/>
         </w:rPr>
-        <w:t xml:space="preserve">Refined Core CPI: </w:t>
+        <w:t xml:space="preserve">Why we cannot drop it immediately: </w:t>
       </w:r>
       <w:r>
-        <w:t>The system calculates a second official index that removes Food (01) and Energy (04):</w:t>
-        <w:br/>
+        <w:t>The basket would change size every day, creating fake jumps when the item returns in stock.</w:t>
       </w:r>
+    </w:p>
+    <w:p>
+      <w:pPr>
+        <w:pStyle w:val="ListBullet"/>
+        <w:spacing w:before="20" w:after="40"/>
+      </w:pPr>
       <w:r>
         <w:rPr>
           <w:b/>
-          <w:color w:val="146E78"/>
         </w:rPr>
-        <w:t>Core CPI = ( ∑_{ex-Food, ex-Energy} w_j · I_j ) / ( ∑ w_j )</w:t>
-        <w:br/>
+        <w:t xml:space="preserve">Why we cannot set price to $0: </w:t>
       </w:r>
       <w:r>
-        <w:t>This shows the underlying, long-term price stability of the economy.</w:t>
+        <w:t>The entire category index would collapse to 0.</w:t>
+      </w:r>
+    </w:p>
+    <w:p>
+      <w:pPr>
+        <w:pStyle w:val="ListBullet"/>
+        <w:spacing w:before="20" w:after="40"/>
+      </w:pPr>
+      <w:r>
+        <w:rPr>
+          <w:b/>
+        </w:rPr>
+        <w:t xml:space="preserve">Why we cannot freeze last price indefinitely: </w:t>
+      </w:r>
+      <w:r>
+        <w:t>If prices are rising across the market, freezing the price pretends inflation is lower than it really is.</w:t>
+      </w:r>
+    </w:p>
+    <w:p>
+      <w:pPr>
+        <w:pStyle w:val="ListBullet"/>
+        <w:spacing w:before="20" w:after="40"/>
+      </w:pPr>
+      <w:r>
+        <w:rPr>
+          <w:b/>
+        </w:rPr>
+        <w:t xml:space="preserve">Our Solution (ILO Class-Mean Imputation): </w:t>
+      </w:r>
+      <w:r>
+        <w:t>When an item is temporarily out-of-stock, its price is estimated using the average price change of similar products in the same category. If missing for more than a week (7 days), the item is recognized as discontinued and cleanly dropped from active calculation.</w:t>
       </w:r>
     </w:p>
     <w:p>

</xml_diff>

<commit_message>
docs: update nowcasting flowchart and replace Metabase images with comprehensive text breakdown
</commit_message>
<xml_diff>
--- a/Cambodia_CPI_Project_Progress_Report.docx
+++ b/Cambodia_CPI_Project_Progress_Report.docx
@@ -91,8 +91,138 @@
     </w:p>
     <w:p>
       <w:pPr>
+        <w:pStyle w:val="Heading2"/>
+        <w:spacing w:before="80" w:after="40"/>
+      </w:pPr>
+      <w:r>
+        <w:t>1.1 Scope and Limitations of the Study</w:t>
+      </w:r>
+    </w:p>
+    <w:p>
+      <w:pPr>
+        <w:pStyle w:val="ListBullet"/>
+        <w:spacing w:before="20" w:after="40"/>
+      </w:pPr>
+      <w:r>
+        <w:rPr>
+          <w:b/>
+          <w:color w:val="0C2C62"/>
+        </w:rPr>
+        <w:t xml:space="preserve">Geographical Scope: </w:t>
+      </w:r>
+      <w:r>
+        <w:t>Focuses on supermarkets, e-commerce platforms, pharmacies, and service providers in Phnom Penh, Cambodia's primary economic hub.</w:t>
+      </w:r>
+    </w:p>
+    <w:p>
+      <w:pPr>
+        <w:pStyle w:val="ListBullet"/>
+        <w:spacing w:before="20" w:after="40"/>
+      </w:pPr>
+      <w:r>
+        <w:rPr>
+          <w:b/>
+          <w:color w:val="0C2C62"/>
+        </w:rPr>
+        <w:t xml:space="preserve">Product Coverage: </w:t>
+      </w:r>
+      <w:r>
+        <w:t>Spans all 12 official United Nations COICOP spending categories (food, housing, transport, health, communication, etc.).</w:t>
+      </w:r>
+    </w:p>
+    <w:p>
+      <w:pPr>
+        <w:pStyle w:val="ListBullet"/>
+        <w:spacing w:before="20" w:after="40"/>
+      </w:pPr>
+      <w:r>
+        <w:rPr>
+          <w:b/>
+          <w:color w:val="0C2C62"/>
+        </w:rPr>
+        <w:t xml:space="preserve">Dual-Currency Handling: </w:t>
+      </w:r>
+      <w:r>
+        <w:t>Standardizes prices in US Dollars (USD) and Cambodian Riel (KHR) into a unified currency using official daily Ministry of Economy and Finance (MEF) exchange rates.</w:t>
+      </w:r>
+    </w:p>
+    <w:p>
+      <w:pPr>
+        <w:pStyle w:val="ListBullet"/>
+        <w:spacing w:before="20" w:after="40"/>
+      </w:pPr>
+      <w:r>
+        <w:rPr>
+          <w:b/>
+          <w:color w:val="0C2C62"/>
+        </w:rPr>
+        <w:t xml:space="preserve">Limitations &amp; Boundaries: </w:t>
+      </w:r>
+      <w:r>
+        <w:t>Does not cover informal wet markets or roadside street stalls; analyzes broad group-level price trends; and runs automated resilience routines to handle occasional retailer layout updates.</w:t>
+      </w:r>
+    </w:p>
+    <w:p>
+      <w:pPr>
+        <w:pStyle w:val="Heading2"/>
+        <w:spacing w:before="80" w:after="40"/>
+      </w:pPr>
+      <w:r>
+        <w:t>1.2 Literature Review: Three Theoretical Pillars</w:t>
+      </w:r>
+    </w:p>
+    <w:p>
+      <w:pPr>
+        <w:pStyle w:val="ListBullet"/>
+        <w:spacing w:before="20" w:after="40"/>
+      </w:pPr>
+      <w:r>
+        <w:rPr>
+          <w:b/>
+          <w:color w:val="146E78"/>
+        </w:rPr>
+        <w:t xml:space="preserve">Pillar 1 — AI &amp; Semantic Vector Classification (BIS / ECB / Bundesbank - Project Spectrum 2024–2026): </w:t>
+      </w:r>
+      <w:r>
+        <w:t>Combines dense semantic vector embeddings (768-dim) with large language model edge-case arbitration and database memoization caching. Achieves over 95% classification precision and cuts processing runtime from days to under 3 minutes.</w:t>
+      </w:r>
+    </w:p>
+    <w:p>
+      <w:pPr>
+        <w:pStyle w:val="ListBullet"/>
+        <w:spacing w:before="20" w:after="40"/>
+      </w:pPr>
+      <w:r>
+        <w:rPr>
+          <w:b/>
+          <w:color w:val="146E78"/>
+        </w:rPr>
+        <w:t xml:space="preserve">Pillar 2 — Econometric Index Theory (IMF, ILO, OECD, Eurostat, UN, World Bank - CPI Manual 2020): </w:t>
+      </w:r>
+      <w:r>
+        <w:t>Validates index formulas against core mathematical axioms (Time-Reversal, Scale Invariance). Proves that the unweighted geometric mean (Jevons) eliminates arithmetic formula bias (Carli/Dutot drift), and specifies geometric class-mean imputation for temporary missing items.</w:t>
+      </w:r>
+    </w:p>
+    <w:p>
+      <w:pPr>
+        <w:pStyle w:val="ListBullet"/>
+        <w:spacing w:before="20" w:after="40"/>
+      </w:pPr>
+      <w:r>
+        <w:rPr>
+          <w:b/>
+          <w:color w:val="146E78"/>
+        </w:rPr>
+        <w:t xml:space="preserve">Pillar 3 — Macroeconomic Nowcasting (De Mol, Giannone, Reichlin): </w:t>
+      </w:r>
+      <w:r>
+        <w:t>Resolves severe multicollinearity in high-dimensional daily price series where standard OLS collapses. Uses Bayesian shrinkage (L2 Ridge regression) to keep matrix inversion stable, achieving a 10% to 20% forecast error reduction over standard autoregressive models.</w:t>
+      </w:r>
+    </w:p>
+    <w:p>
+      <w:pPr>
         <w:pStyle w:val="Heading1"/>
-        <w:spacing w:before="240" w:after="80"/>
+        <w:spacing w:before="200" w:after="80"/>
       </w:pPr>
       <w:r>
         <w:t>2. Architecture</w:t>
@@ -2035,6 +2165,56 @@
         <w:pStyle w:val="Heading3"/>
       </w:pPr>
       <w:r>
+        <w:t>4.4.3 Why Store Balancing is Essential (1 Store = 1 Vote)</w:t>
+      </w:r>
+    </w:p>
+    <w:p>
+      <w:pPr>
+        <w:spacing w:before="20" w:after="40"/>
+      </w:pPr>
+      <w:r>
+        <w:rPr>
+          <w:b/>
+          <w:i/>
+        </w:rPr>
+        <w:t>Core Question: If a big supermarket lists 90 types of rice and a small local shop lists 10, should the big supermarket control 90% of our inflation calculation?</w:t>
+      </w:r>
+    </w:p>
+    <w:p>
+      <w:pPr>
+        <w:pStyle w:val="ListBullet"/>
+        <w:spacing w:before="20" w:after="20"/>
+      </w:pPr>
+      <w:r>
+        <w:rPr>
+          <w:b/>
+        </w:rPr>
+        <w:t xml:space="preserve">Without Store Balancing (Danger): </w:t>
+      </w:r>
+      <w:r>
+        <w:t>Stores with the largest catalogs get an overwhelming majority of mathematical power. Having more items on a web page does not mean households buy more there. If a mega-store runs a flash sale, the entire national CPI would artificially crash.</w:t>
+      </w:r>
+    </w:p>
+    <w:p>
+      <w:pPr>
+        <w:pStyle w:val="ListBullet"/>
+        <w:spacing w:before="20" w:after="20"/>
+      </w:pPr>
+      <w:r>
+        <w:rPr>
+          <w:b/>
+        </w:rPr>
+        <w:t xml:space="preserve">With Store Balancing (Our Solution): </w:t>
+      </w:r>
+      <w:r>
+        <w:t>Fair voting system where 1 store = 1 vote regardless of catalog size. A sale at one individual store cannot distort the national price index by itself, faithfully reflecting genuine cross-market price trends.</w:t>
+      </w:r>
+    </w:p>
+    <w:p>
+      <w:pPr>
+        <w:pStyle w:val="Heading3"/>
+      </w:pPr>
+      <w:r>
         <w:t>4.4.4 Higher-Level Aggregation (Laspeyres CSES 2020 Weights)</w:t>
       </w:r>
     </w:p>
@@ -2185,6 +2365,38 @@
         <w:pStyle w:val="Heading3"/>
       </w:pPr>
       <w:r>
+        <w:t>4.4.6 New Products on Non-Base Dates (Baseline Entry Price Splicing)</w:t>
+      </w:r>
+    </w:p>
+    <w:p>
+      <w:pPr>
+        <w:spacing w:before="20" w:after="40"/>
+      </w:pPr>
+      <w:r>
+        <w:rPr>
+          <w:b/>
+        </w:rPr>
+        <w:t xml:space="preserve">Challenge: </w:t>
+      </w:r>
+      <w:r>
+        <w:t>How do we calculate the price relative when a brand-new product appears in a store after the official base date (e.g., coffee launched on August 20 at $5.00 with no price on August 18)?</w:t>
+        <w:br/>
+      </w:r>
+      <w:r>
+        <w:rPr>
+          <w:b/>
+        </w:rPr>
+        <w:t xml:space="preserve">Solution: </w:t>
+      </w:r>
+      <w:r>
+        <w:t>On its first appearance day, the system establishes the item's first observed entry price as its personal baseline price ($5.00 / $5.00 = 1.00). On subsequent days, the pipeline tracks relative price movements against this baseline without creating fictitious historical shocks.</w:t>
+      </w:r>
+    </w:p>
+    <w:p>
+      <w:pPr>
+        <w:pStyle w:val="Heading3"/>
+      </w:pPr>
+      <w:r>
         <w:t>4.4.7 Missing Price &amp; Out-of-Stock Handling</w:t>
       </w:r>
     </w:p>
@@ -2328,7 +2540,7 @@
       <w:r>
         <w:drawing>
           <wp:inline xmlns:a="http://schemas.openxmlformats.org/drawingml/2006/main" xmlns:pic="http://schemas.openxmlformats.org/drawingml/2006/picture">
-            <wp:extent cx="5303520" cy="3748145"/>
+            <wp:extent cx="5303520" cy="3414903"/>
             <wp:docPr id="2" name="Picture 2"/>
             <wp:cNvGraphicFramePr>
               <a:graphicFrameLocks noChangeAspect="1"/>
@@ -2349,7 +2561,7 @@
                   <pic:spPr>
                     <a:xfrm>
                       <a:off x="0" y="0"/>
-                      <a:ext cx="5303520" cy="3748145"/>
+                      <a:ext cx="5303520" cy="3414903"/>
                     </a:xfrm>
                     <a:prstGeom prst="rect"/>
                   </pic:spPr>
@@ -2512,7 +2724,7 @@
     </w:p>
     <w:p>
       <w:r>
-        <w:t>To provide actionable macroeconomic intelligence and continuous pipeline observability, the system implements three dedicated production dashboards in Metabase (running in Docker containers):</w:t>
+        <w:t>To provide actionable macroeconomic intelligence for MEF policymakers and continuous operational observability for data engineers, the system implements three dedicated dashboards in Metabase. Below is a detailed breakdown of what the system monitors and what is presented across each dashboard:</w:t>
       </w:r>
     </w:p>
     <w:p>
@@ -2520,212 +2732,375 @@
         <w:pStyle w:val="Heading2"/>
       </w:pPr>
       <w:r>
-        <w:t>Dashboard 1: Macro CPI &amp; Inflation Analytics</w:t>
+        <w:t>5.1 What We Monitor Across the System</w:t>
       </w:r>
     </w:p>
     <w:p>
       <w:pPr>
-        <w:spacing w:before="20" w:after="80"/>
+        <w:pStyle w:val="ListBullet"/>
+        <w:spacing w:before="20" w:after="40"/>
       </w:pPr>
       <w:r>
-        <w:t>Shows daily Headline CPI and Core CPI (which removes volatile food and fuel prices), monthly inflation rates, and price changes across all 12 consumption categories compared against official government reports.</w:t>
+        <w:rPr>
+          <w:b/>
+          <w:color w:val="0C2C62"/>
+        </w:rPr>
+        <w:t xml:space="preserve">High-Frequency Price Momentum: </w:t>
+      </w:r>
+      <w:r>
+        <w:t>Daily price movements across essential household goods to catch inflation spikes weeks before official monthly statistics are compiled.</w:t>
       </w:r>
     </w:p>
     <w:p>
       <w:pPr>
-        <w:spacing w:before="80" w:after="40"/>
-        <w:jc w:val="center"/>
+        <w:pStyle w:val="ListBullet"/>
+        <w:spacing w:before="20" w:after="40"/>
       </w:pPr>
       <w:r>
-        <w:drawing>
-          <wp:inline xmlns:a="http://schemas.openxmlformats.org/drawingml/2006/main" xmlns:pic="http://schemas.openxmlformats.org/drawingml/2006/picture">
-            <wp:extent cx="5303520" cy="2327196"/>
-            <wp:docPr id="4" name="Picture 4"/>
-            <wp:cNvGraphicFramePr>
-              <a:graphicFrameLocks noChangeAspect="1"/>
-            </wp:cNvGraphicFramePr>
-            <a:graphic>
-              <a:graphicData uri="http://schemas.openxmlformats.org/drawingml/2006/picture">
-                <pic:pic>
-                  <pic:nvPicPr>
-                    <pic:cNvPr id="0" name="dashboard_97_macro_cpi.png"/>
-                    <pic:cNvPicPr/>
-                  </pic:nvPicPr>
-                  <pic:blipFill>
-                    <a:blip r:embed="rId14"/>
-                    <a:stretch>
-                      <a:fillRect/>
-                    </a:stretch>
-                  </pic:blipFill>
-                  <pic:spPr>
-                    <a:xfrm>
-                      <a:off x="0" y="0"/>
-                      <a:ext cx="5303520" cy="2327196"/>
-                    </a:xfrm>
-                    <a:prstGeom prst="rect"/>
-                  </pic:spPr>
-                </pic:pic>
-              </a:graphicData>
-            </a:graphic>
-          </wp:inline>
-        </w:drawing>
+        <w:rPr>
+          <w:b/>
+          <w:color w:val="0C2C62"/>
+        </w:rPr>
+        <w:t xml:space="preserve">Core vs Headline Stability: </w:t>
+      </w:r>
+      <w:r>
+        <w:t>Tracks underlying price changes by stripping out volatile seasonal food and global fuel costs.</w:t>
       </w:r>
     </w:p>
     <w:p>
       <w:pPr>
-        <w:spacing w:before="20" w:after="120"/>
-        <w:jc w:val="center"/>
+        <w:pStyle w:val="ListBullet"/>
+        <w:spacing w:before="20" w:after="40"/>
       </w:pPr>
       <w:r>
         <w:rPr>
-          <w:rFonts w:ascii="Calibri" w:hAnsi="Calibri"/>
-          <w:i/>
-          <w:color w:val="646464"/>
-          <w:sz w:val="17"/>
+          <w:b/>
+          <w:color w:val="0C2C62"/>
         </w:rPr>
-        <w:t>Figure 4: Metabase Dashboard 1 — Real-Time Macro CPI &amp; Inflation Analytics</w:t>
+        <w:t xml:space="preserve">Multi-Store Catalog Dynamics: </w:t>
+      </w:r>
+      <w:r>
+        <w:t>Monitors price discrepancies, store discounts, and stock availability across major retail chains in Phnom Penh.</w:t>
       </w:r>
     </w:p>
     <w:p>
       <w:pPr>
-        <w:pStyle w:val="Heading2"/>
+        <w:pStyle w:val="ListBullet"/>
+        <w:spacing w:before="20" w:after="40"/>
       </w:pPr>
       <w:r>
-        <w:t>Dashboard 2: Operations &amp; Data Source Telemetry</w:t>
+        <w:rPr>
+          <w:b/>
+          <w:color w:val="0C2C62"/>
+        </w:rPr>
+        <w:t xml:space="preserve">Supply Chain &amp; Spillover Effects: </w:t>
+      </w:r>
+      <w:r>
+        <w:t>Measures how fuel price adjustments at Tela Khmer translate into food delivery and transport cost inflation.</w:t>
       </w:r>
     </w:p>
     <w:p>
       <w:pPr>
-        <w:spacing w:before="20" w:after="80"/>
+        <w:pStyle w:val="ListBullet"/>
+        <w:spacing w:before="20" w:after="40"/>
       </w:pPr>
       <w:r>
-        <w:t>Tracks the daily health of our scrapers across all 11 sources. It shows how many product prices were collected each day, scraping speed, and website connection status.</w:t>
+        <w:rPr>
+          <w:b/>
+          <w:color w:val="0C2C62"/>
+        </w:rPr>
+        <w:t xml:space="preserve">Pipeline Operational Health: </w:t>
+      </w:r>
+      <w:r>
+        <w:t>Tracks automated daily Airflow DAG executions, scraping runtimes, network retries, and data ingestion volumes.</w:t>
       </w:r>
     </w:p>
     <w:p>
       <w:pPr>
-        <w:spacing w:before="80" w:after="40"/>
-        <w:jc w:val="center"/>
+        <w:pStyle w:val="ListBullet"/>
+        <w:spacing w:before="20" w:after="40"/>
       </w:pPr>
       <w:r>
-        <w:drawing>
-          <wp:inline xmlns:a="http://schemas.openxmlformats.org/drawingml/2006/main" xmlns:pic="http://schemas.openxmlformats.org/drawingml/2006/picture">
-            <wp:extent cx="5303520" cy="2327196"/>
-            <wp:docPr id="5" name="Picture 5"/>
-            <wp:cNvGraphicFramePr>
-              <a:graphicFrameLocks noChangeAspect="1"/>
-            </wp:cNvGraphicFramePr>
-            <a:graphic>
-              <a:graphicData uri="http://schemas.openxmlformats.org/drawingml/2006/picture">
-                <pic:pic>
-                  <pic:nvPicPr>
-                    <pic:cNvPr id="0" name="dashboard_98_telemetry.png"/>
-                    <pic:cNvPicPr/>
-                  </pic:nvPicPr>
-                  <pic:blipFill>
-                    <a:blip r:embed="rId15"/>
-                    <a:stretch>
-                      <a:fillRect/>
-                    </a:stretch>
-                  </pic:blipFill>
-                  <pic:spPr>
-                    <a:xfrm>
-                      <a:off x="0" y="0"/>
-                      <a:ext cx="5303520" cy="2327196"/>
-                    </a:xfrm>
-                    <a:prstGeom prst="rect"/>
-                  </pic:spPr>
-                </pic:pic>
-              </a:graphicData>
-            </a:graphic>
-          </wp:inline>
-        </w:drawing>
+        <w:rPr>
+          <w:b/>
+          <w:color w:val="0C2C62"/>
+        </w:rPr>
+        <w:t xml:space="preserve">Data Quality &amp; Integrity: </w:t>
+      </w:r>
+      <w:r>
+        <w:t>Continuously audits currency conversion accuracy, metric normalization, product matching confidence, and AI classification coverage.</w:t>
       </w:r>
     </w:p>
     <w:p>
       <w:pPr>
-        <w:spacing w:before="20" w:after="120"/>
-        <w:jc w:val="center"/>
+        <w:pStyle w:val="Heading2"/>
       </w:pPr>
       <w:r>
-        <w:rPr>
-          <w:rFonts w:ascii="Calibri" w:hAnsi="Calibri"/>
-          <w:i/>
-          <w:color w:val="646464"/>
-          <w:sz w:val="17"/>
-        </w:rPr>
-        <w:t>Figure 5: Metabase Dashboard 2 — Data Lake Operations &amp; Scraping Telemetry</w:t>
+        <w:t>5.2 What We Show on Each Metabase Dashboard</w:t>
       </w:r>
     </w:p>
     <w:p>
       <w:pPr>
-        <w:pStyle w:val="Heading2"/>
+        <w:pStyle w:val="Heading3"/>
       </w:pPr>
       <w:r>
-        <w:t>Dashboard 3: Silver Layer Data Quality Screener</w:t>
+        <w:t>Dashboard 1: Macro CPI &amp; Inflation Analytics (Policy Decision-Support)</w:t>
       </w:r>
     </w:p>
     <w:p>
       <w:pPr>
-        <w:spacing w:before="20" w:after="80"/>
+        <w:pStyle w:val="ListBullet"/>
+        <w:spacing w:before="20" w:after="30"/>
       </w:pPr>
       <w:r>
-        <w:t>Checks the cleanliness of our data every day. It tracks product size standardization (converting items to 1kg or 1L), USD to Khmer Riel currency conversion, product matching across stores, and AI classification accuracy.</w:t>
+        <w:rPr>
+          <w:b/>
+          <w:color w:val="146E78"/>
+        </w:rPr>
+        <w:t xml:space="preserve">Daily Headline CPI Tracker: </w:t>
+      </w:r>
+      <w:r>
+        <w:t>Interactive time-series displaying the composite daily CPI index anchored at August 18, 2026 = 100.00.</w:t>
       </w:r>
     </w:p>
     <w:p>
       <w:pPr>
-        <w:spacing w:before="80" w:after="40"/>
-        <w:jc w:val="center"/>
+        <w:pStyle w:val="ListBullet"/>
+        <w:spacing w:before="20" w:after="30"/>
       </w:pPr>
       <w:r>
-        <w:drawing>
-          <wp:inline xmlns:a="http://schemas.openxmlformats.org/drawingml/2006/main" xmlns:pic="http://schemas.openxmlformats.org/drawingml/2006/picture">
-            <wp:extent cx="5303520" cy="2327196"/>
-            <wp:docPr id="6" name="Picture 6"/>
-            <wp:cNvGraphicFramePr>
-              <a:graphicFrameLocks noChangeAspect="1"/>
-            </wp:cNvGraphicFramePr>
-            <a:graphic>
-              <a:graphicData uri="http://schemas.openxmlformats.org/drawingml/2006/picture">
-                <pic:pic>
-                  <pic:nvPicPr>
-                    <pic:cNvPr id="0" name="dashboard_99_silver_quality.png"/>
-                    <pic:cNvPicPr/>
-                  </pic:nvPicPr>
-                  <pic:blipFill>
-                    <a:blip r:embed="rId16"/>
-                    <a:stretch>
-                      <a:fillRect/>
-                    </a:stretch>
-                  </pic:blipFill>
-                  <pic:spPr>
-                    <a:xfrm>
-                      <a:off x="0" y="0"/>
-                      <a:ext cx="5303520" cy="2327196"/>
-                    </a:xfrm>
-                    <a:prstGeom prst="rect"/>
-                  </pic:spPr>
-                </pic:pic>
-              </a:graphicData>
-            </a:graphic>
-          </wp:inline>
-        </w:drawing>
+        <w:rPr>
+          <w:b/>
+          <w:color w:val="146E78"/>
+        </w:rPr>
+        <w:t xml:space="preserve">Refined Core CPI Indicator: </w:t>
+      </w:r>
+      <w:r>
+        <w:t>Parallel trendline isolating structural core inflation from volatile agricultural food and energy swings.</w:t>
       </w:r>
     </w:p>
     <w:p>
       <w:pPr>
-        <w:spacing w:before="20" w:after="120"/>
-        <w:jc w:val="center"/>
+        <w:pStyle w:val="ListBullet"/>
+        <w:spacing w:before="20" w:after="30"/>
       </w:pPr>
       <w:r>
         <w:rPr>
-          <w:rFonts w:ascii="Calibri" w:hAnsi="Calibri"/>
-          <w:i/>
-          <w:color w:val="646464"/>
-          <w:sz w:val="17"/>
+          <w:b/>
+          <w:color w:val="146E78"/>
         </w:rPr>
-        <w:t>Figure 6: Metabase Dashboard 3 — Silver Layer Data Quality &amp; Classification Screener</w:t>
+        <w:t xml:space="preserve">Month-to-Date (MTD) &amp; Year-to-Date (YTD) Inflation Cards: </w:t>
+      </w:r>
+      <w:r>
+        <w:t>Real-time summary KPI cards showing current monthly inflation momentum.</w:t>
+      </w:r>
+    </w:p>
+    <w:p>
+      <w:pPr>
+        <w:pStyle w:val="ListBullet"/>
+        <w:spacing w:before="20" w:after="30"/>
+      </w:pPr>
+      <w:r>
+        <w:rPr>
+          <w:b/>
+          <w:color w:val="146E78"/>
+        </w:rPr>
+        <w:t xml:space="preserve">12 UN COICOP Division Breakdown: </w:t>
+      </w:r>
+      <w:r>
+        <w:t>Comparative bar and area charts tracking individual indices for all 12 divisions weighted by CSES 2020 household expenditure shares.</w:t>
+      </w:r>
+    </w:p>
+    <w:p>
+      <w:pPr>
+        <w:pStyle w:val="ListBullet"/>
+        <w:spacing w:before="20" w:after="30"/>
+      </w:pPr>
+      <w:r>
+        <w:rPr>
+          <w:b/>
+          <w:color w:val="146E78"/>
+        </w:rPr>
+        <w:t xml:space="preserve">Early Inflation Nowcast vs Official NIS: </w:t>
+      </w:r>
+      <w:r>
+        <w:t>Forward-looking monthly inflation forecast plotted with dynamic uncertainty bounds, predicting official figures 25 to 45 days in advance.</w:t>
+      </w:r>
+    </w:p>
+    <w:p>
+      <w:pPr>
+        <w:pStyle w:val="ListBullet"/>
+        <w:spacing w:before="20" w:after="30"/>
+      </w:pPr>
+      <w:r>
+        <w:rPr>
+          <w:b/>
+          <w:color w:val="146E78"/>
+        </w:rPr>
+        <w:t xml:space="preserve">Official Benchmark Conversion: </w:t>
+      </w:r>
+      <w:r>
+        <w:t>Unified baseline converter displaying calculated indices on the official NIS 2006 = 100 scale (using the 2.19007 conversion multiplier).</w:t>
+      </w:r>
+    </w:p>
+    <w:p>
+      <w:pPr>
+        <w:pStyle w:val="Heading3"/>
+      </w:pPr>
+      <w:r>
+        <w:t>Dashboard 2: Operations &amp; Scraping Telemetry (Pipeline Observability)</w:t>
+      </w:r>
+    </w:p>
+    <w:p>
+      <w:pPr>
+        <w:pStyle w:val="ListBullet"/>
+        <w:spacing w:before="20" w:after="30"/>
+      </w:pPr>
+      <w:r>
+        <w:rPr>
+          <w:b/>
+          <w:color w:val="146E78"/>
+        </w:rPr>
+        <w:t xml:space="preserve">Daily Scraping Yield per Store: </w:t>
+      </w:r>
+      <w:r>
+        <w:t>Bar chart tracking the total number of valid price quotes successfully scraped each morning across AEON, DeliShop, GrabMart, L192, Khmer24, etc.</w:t>
+      </w:r>
+    </w:p>
+    <w:p>
+      <w:pPr>
+        <w:pStyle w:val="ListBullet"/>
+        <w:spacing w:before="20" w:after="30"/>
+      </w:pPr>
+      <w:r>
+        <w:rPr>
+          <w:b/>
+          <w:color w:val="146E78"/>
+        </w:rPr>
+        <w:t xml:space="preserve">Scraper Execution Status &amp; Latency: </w:t>
+      </w:r>
+      <w:r>
+        <w:t>Real-time health indicator reporting job run durations, HTTP response times, and error rates.</w:t>
+      </w:r>
+    </w:p>
+    <w:p>
+      <w:pPr>
+        <w:pStyle w:val="ListBullet"/>
+        <w:spacing w:before="20" w:after="30"/>
+      </w:pPr>
+      <w:r>
+        <w:rPr>
+          <w:b/>
+          <w:color w:val="146E78"/>
+        </w:rPr>
+        <w:t xml:space="preserve">Anti-Blocking Resilience Monitor: </w:t>
+      </w:r>
+      <w:r>
+        <w:t>Tracks connection modes, recording successful direct API calls vs automated fallbacks to Playwright headless browser disguised sessions.</w:t>
+      </w:r>
+    </w:p>
+    <w:p>
+      <w:pPr>
+        <w:pStyle w:val="ListBullet"/>
+        <w:spacing w:before="20" w:after="30"/>
+      </w:pPr>
+      <w:r>
+        <w:rPr>
+          <w:b/>
+          <w:color w:val="146E78"/>
+        </w:rPr>
+        <w:t xml:space="preserve">Raw Data Lake Ingestion Volume: </w:t>
+      </w:r>
+      <w:r>
+        <w:t>Daily count of raw price records ingested into bronze.raw_prices with timestamp and batch ID tracking.</w:t>
+      </w:r>
+    </w:p>
+    <w:p>
+      <w:pPr>
+        <w:pStyle w:val="Heading3"/>
+      </w:pPr>
+      <w:r>
+        <w:t>Dashboard 3: Silver Layer Data Quality Screener (Integrity &amp; AI Audit)</w:t>
+      </w:r>
+    </w:p>
+    <w:p>
+      <w:pPr>
+        <w:pStyle w:val="ListBullet"/>
+        <w:spacing w:before="20" w:after="30"/>
+      </w:pPr>
+      <w:r>
+        <w:rPr>
+          <w:b/>
+          <w:color w:val="146E78"/>
+        </w:rPr>
+        <w:t xml:space="preserve">Product Matching &amp; Deduplication Rates: </w:t>
+      </w:r>
+      <w:r>
+        <w:t>Summary table showing the number of items linked via Barcodes (Level 1), Store SKUs (Level 2), Clean Titles (Level 3), and Vector Embeddings (Level 4).</w:t>
+      </w:r>
+    </w:p>
+    <w:p>
+      <w:pPr>
+        <w:pStyle w:val="ListBullet"/>
+        <w:spacing w:before="20" w:after="30"/>
+      </w:pPr>
+      <w:r>
+        <w:rPr>
+          <w:b/>
+          <w:color w:val="146E78"/>
+        </w:rPr>
+        <w:t xml:space="preserve">AI COICOP Classification Coverage: </w:t>
+      </w:r>
+      <w:r>
+        <w:t>Audit gauge tracking the percentage of catalog items mapped to official NIS 5-digit codes vs pending edge cases.</w:t>
+      </w:r>
+    </w:p>
+    <w:p>
+      <w:pPr>
+        <w:pStyle w:val="ListBullet"/>
+        <w:spacing w:before="20" w:after="30"/>
+      </w:pPr>
+      <w:r>
+        <w:rPr>
+          <w:b/>
+          <w:color w:val="146E78"/>
+        </w:rPr>
+        <w:t xml:space="preserve">Out-of-Stock &amp; Discontinuation Screener: </w:t>
+      </w:r>
+      <w:r>
+        <w:t>Monitors temporarily unavailable items undergoing ILO class-mean price imputation and flags discontinued products dropped after 7 consecutive days.</w:t>
+      </w:r>
+    </w:p>
+    <w:p>
+      <w:pPr>
+        <w:pStyle w:val="ListBullet"/>
+        <w:spacing w:before="20" w:after="30"/>
+      </w:pPr>
+      <w:r>
+        <w:rPr>
+          <w:b/>
+          <w:color w:val="146E78"/>
+        </w:rPr>
+        <w:t xml:space="preserve">Price Anomaly &amp; Extreme Outlier Guard: </w:t>
+      </w:r>
+      <w:r>
+        <w:t>Automated alert card highlighting any scraped price change exceeding 10x or falling below 0.1x for human review before Gold layer index aggregation.</w:t>
+      </w:r>
+    </w:p>
+    <w:p>
+      <w:pPr>
+        <w:pStyle w:val="ListBullet"/>
+        <w:spacing w:before="20" w:after="30"/>
+      </w:pPr>
+      <w:r>
+        <w:rPr>
+          <w:b/>
+          <w:color w:val="146E78"/>
+        </w:rPr>
+        <w:t xml:space="preserve">Currency &amp; Unit Standardization Screener: </w:t>
+      </w:r>
+      <w:r>
+        <w:t>Verification table tracking daily MEF official exchange rates and metric conversion consistency (e.g., KHR/kg and KHR/L).</w:t>
       </w:r>
     </w:p>
     <w:sectPr>

</xml_diff>

<commit_message>
docs: regenerate clean nowcasting flowchart v3 with modern layout and typography
</commit_message>
<xml_diff>
--- a/Cambodia_CPI_Project_Progress_Report.docx
+++ b/Cambodia_CPI_Project_Progress_Report.docx
@@ -2540,7 +2540,7 @@
       <w:r>
         <w:drawing>
           <wp:inline xmlns:a="http://schemas.openxmlformats.org/drawingml/2006/main" xmlns:pic="http://schemas.openxmlformats.org/drawingml/2006/picture">
-            <wp:extent cx="5303520" cy="3414903"/>
+            <wp:extent cx="5303520" cy="3384773"/>
             <wp:docPr id="2" name="Picture 2"/>
             <wp:cNvGraphicFramePr>
               <a:graphicFrameLocks noChangeAspect="1"/>
@@ -2561,7 +2561,7 @@
                   <pic:spPr>
                     <a:xfrm>
                       <a:off x="0" y="0"/>
-                      <a:ext cx="5303520" cy="3414903"/>
+                      <a:ext cx="5303520" cy="3384773"/>
                     </a:xfrm>
                     <a:prstGeom prst="rect"/>
                   </pic:spPr>

</xml_diff>